<commit_message>
Update Business case template.docx
</commit_message>
<xml_diff>
--- a/Documentation/Business case template.docx
+++ b/Documentation/Business case template.docx
@@ -1,6 +1,6 @@
 
 <file path=word/document.xml><?xml version="1.0" encoding="utf-8"?>
-<w:document xmlns:wpc="http://schemas.microsoft.com/office/word/2010/wordprocessingCanvas" xmlns:cx="http://schemas.microsoft.com/office/drawing/2014/chartex" xmlns:cx1="http://schemas.microsoft.com/office/drawing/2015/9/8/chartex" xmlns:cx2="http://schemas.microsoft.com/office/drawing/2015/10/21/chartex" xmlns:cx3="http://schemas.microsoft.com/office/drawing/2016/5/9/chartex" xmlns:cx4="http://schemas.microsoft.com/office/drawing/2016/5/10/chartex" xmlns:cx5="http://schemas.microsoft.com/office/drawing/2016/5/11/chartex" xmlns:cx6="http://schemas.microsoft.com/office/drawing/2016/5/12/chartex" xmlns:cx7="http://schemas.microsoft.com/office/drawing/2016/5/13/chartex" xmlns:cx8="http://schemas.microsoft.com/office/drawing/2016/5/14/chartex" xmlns:mc="http://schemas.openxmlformats.org/markup-compatibility/2006" xmlns:aink="http://schemas.microsoft.com/office/drawing/2016/ink" xmlns:am3d="http://schemas.microsoft.com/office/drawing/2017/model3d" xmlns:o="urn:schemas-microsoft-com:office:office" xmlns:r="http://schemas.openxmlformats.org/officeDocument/2006/relationships" xmlns:m="http://schemas.openxmlformats.org/officeDocument/2006/math" xmlns:v="urn:schemas-microsoft-com:vml" xmlns:wp14="http://schemas.microsoft.com/office/word/2010/wordprocessingDrawing" xmlns:wp="http://schemas.openxmlformats.org/drawingml/2006/wordprocessingDrawing" xmlns:w10="urn:schemas-microsoft-com:office:word" xmlns:w="http://schemas.openxmlformats.org/wordprocessingml/2006/main" xmlns:w14="http://schemas.microsoft.com/office/word/2010/wordml" xmlns:w15="http://schemas.microsoft.com/office/word/2012/wordml" xmlns:w16cid="http://schemas.microsoft.com/office/word/2016/wordml/cid" xmlns:w16se="http://schemas.microsoft.com/office/word/2015/wordml/symex" xmlns:wpg="http://schemas.microsoft.com/office/word/2010/wordprocessingGroup" xmlns:wpi="http://schemas.microsoft.com/office/word/2010/wordprocessingInk" xmlns:wne="http://schemas.microsoft.com/office/word/2006/wordml" xmlns:wps="http://schemas.microsoft.com/office/word/2010/wordprocessingShape" mc:Ignorable="w14 w15 w16se w16cid wp14">
+<w:document xmlns:wpc="http://schemas.microsoft.com/office/word/2010/wordprocessingCanvas" xmlns:cx="http://schemas.microsoft.com/office/drawing/2014/chartex" xmlns:cx1="http://schemas.microsoft.com/office/drawing/2015/9/8/chartex" xmlns:cx2="http://schemas.microsoft.com/office/drawing/2015/10/21/chartex" xmlns:cx3="http://schemas.microsoft.com/office/drawing/2016/5/9/chartex" xmlns:cx4="http://schemas.microsoft.com/office/drawing/2016/5/10/chartex" xmlns:cx5="http://schemas.microsoft.com/office/drawing/2016/5/11/chartex" xmlns:cx6="http://schemas.microsoft.com/office/drawing/2016/5/12/chartex" xmlns:cx7="http://schemas.microsoft.com/office/drawing/2016/5/13/chartex" xmlns:cx8="http://schemas.microsoft.com/office/drawing/2016/5/14/chartex" xmlns:mc="http://schemas.openxmlformats.org/markup-compatibility/2006" xmlns:aink="http://schemas.microsoft.com/office/drawing/2016/ink" xmlns:am3d="http://schemas.microsoft.com/office/drawing/2017/model3d" xmlns:o="urn:schemas-microsoft-com:office:office" xmlns:oel="http://schemas.microsoft.com/office/2019/extlst" xmlns:r="http://schemas.openxmlformats.org/officeDocument/2006/relationships" xmlns:m="http://schemas.openxmlformats.org/officeDocument/2006/math" xmlns:v="urn:schemas-microsoft-com:vml" xmlns:wp14="http://schemas.microsoft.com/office/word/2010/wordprocessingDrawing" xmlns:wp="http://schemas.openxmlformats.org/drawingml/2006/wordprocessingDrawing" xmlns:w10="urn:schemas-microsoft-com:office:word" xmlns:w="http://schemas.openxmlformats.org/wordprocessingml/2006/main" xmlns:w14="http://schemas.microsoft.com/office/word/2010/wordml" xmlns:w15="http://schemas.microsoft.com/office/word/2012/wordml" xmlns:w16cex="http://schemas.microsoft.com/office/word/2018/wordml/cex" xmlns:w16cid="http://schemas.microsoft.com/office/word/2016/wordml/cid" xmlns:w16="http://schemas.microsoft.com/office/word/2018/wordml" xmlns:w16du="http://schemas.microsoft.com/office/word/2023/wordml/word16du" xmlns:w16sdtdh="http://schemas.microsoft.com/office/word/2020/wordml/sdtdatahash" xmlns:w16sdtfl="http://schemas.microsoft.com/office/word/2024/wordml/sdtformatlock" xmlns:w16se="http://schemas.microsoft.com/office/word/2015/wordml/symex" xmlns:wpg="http://schemas.microsoft.com/office/word/2010/wordprocessingGroup" xmlns:wpi="http://schemas.microsoft.com/office/word/2010/wordprocessingInk" xmlns:wne="http://schemas.microsoft.com/office/word/2006/wordml" xmlns:wps="http://schemas.microsoft.com/office/word/2010/wordprocessingShape" mc:Ignorable="w14 w15 w16se w16cid w16 w16cex w16sdtdh w16sdtfl w16du wp14">
   <w:body>
     <w:p>
       <w:pPr>
@@ -29,6 +29,7 @@
     <w:p>
       <w:pPr>
         <w:rPr>
+          <w:color w:val="00B0F0"/>
           <w:sz w:val="23"/>
           <w:szCs w:val="23"/>
           <w:lang w:val="en-GB"/>
@@ -36,6 +37,7 @@
       </w:pPr>
       <w:r>
         <w:rPr>
+          <w:color w:val="00B0F0"/>
           <w:sz w:val="23"/>
           <w:szCs w:val="23"/>
           <w:lang w:val="en-GB"/>
@@ -82,11 +84,13 @@
       <w:pPr>
         <w:jc w:val="both"/>
         <w:rPr>
-          <w:lang w:val="en-GB"/>
-        </w:rPr>
-      </w:pPr>
-      <w:r>
-        <w:rPr>
+          <w:color w:val="00B0F0"/>
+          <w:lang w:val="en-GB"/>
+        </w:rPr>
+      </w:pPr>
+      <w:r>
+        <w:rPr>
+          <w:color w:val="00B0F0"/>
           <w:lang w:val="en-GB"/>
         </w:rPr>
         <w:t>The heading above is just a placeholder.  You need to provide a heading which draws attention to your actual problem, e.g. “Healthcare worker patient notes”.  This section should provide a general description of the problem you are addressing.  Include information such as:</w:t>
@@ -101,11 +105,13 @@
         </w:numPr>
         <w:jc w:val="both"/>
         <w:rPr>
-          <w:lang w:val="en-GB"/>
-        </w:rPr>
-      </w:pPr>
-      <w:r>
-        <w:rPr>
+          <w:color w:val="00B0F0"/>
+          <w:lang w:val="en-GB"/>
+        </w:rPr>
+      </w:pPr>
+      <w:r>
+        <w:rPr>
+          <w:color w:val="00B0F0"/>
           <w:lang w:val="en-GB"/>
         </w:rPr>
         <w:t>What the problem is – not the lack of software, but what is the actual real-world problem that you can help solve by providing software.</w:t>
@@ -120,11 +126,13 @@
         </w:numPr>
         <w:jc w:val="both"/>
         <w:rPr>
-          <w:lang w:val="en-GB"/>
-        </w:rPr>
-      </w:pPr>
-      <w:r>
-        <w:rPr>
+          <w:color w:val="00B0F0"/>
+          <w:lang w:val="en-GB"/>
+        </w:rPr>
+      </w:pPr>
+      <w:r>
+        <w:rPr>
+          <w:color w:val="00B0F0"/>
           <w:lang w:val="en-GB"/>
         </w:rPr>
         <w:t>The domain of the problem (i.e. where it takes place)</w:t>
@@ -139,11 +147,13 @@
         </w:numPr>
         <w:jc w:val="both"/>
         <w:rPr>
-          <w:lang w:val="en-GB"/>
-        </w:rPr>
-      </w:pPr>
-      <w:r>
-        <w:rPr>
+          <w:color w:val="00B0F0"/>
+          <w:lang w:val="en-GB"/>
+        </w:rPr>
+      </w:pPr>
+      <w:r>
+        <w:rPr>
+          <w:color w:val="00B0F0"/>
           <w:lang w:val="en-GB"/>
         </w:rPr>
         <w:t>Who is encountering the problem?</w:t>
@@ -153,6 +163,7 @@
       <w:pPr>
         <w:jc w:val="both"/>
         <w:rPr>
+          <w:color w:val="00B0F0"/>
           <w:lang w:val="en-GB"/>
         </w:rPr>
       </w:pPr>
@@ -161,11 +172,13 @@
       <w:pPr>
         <w:jc w:val="both"/>
         <w:rPr>
-          <w:lang w:val="en-GB"/>
-        </w:rPr>
-      </w:pPr>
-      <w:r>
-        <w:rPr>
+          <w:color w:val="00B0F0"/>
+          <w:lang w:val="en-GB"/>
+        </w:rPr>
+      </w:pPr>
+      <w:r>
+        <w:rPr>
+          <w:color w:val="00B0F0"/>
           <w:lang w:val="en-GB"/>
         </w:rPr>
         <w:t>Be as descriptive as you can.  Think about how much information you will provide a possible financial backer to make them care about the problem and make an investment.</w:t>
@@ -1115,11 +1128,13 @@
       <w:pPr>
         <w:jc w:val="both"/>
         <w:rPr>
-          <w:lang w:val="en-GB"/>
-        </w:rPr>
-      </w:pPr>
-      <w:r>
-        <w:rPr>
+          <w:color w:val="00B0F0"/>
+          <w:lang w:val="en-GB"/>
+        </w:rPr>
+      </w:pPr>
+      <w:r>
+        <w:rPr>
+          <w:color w:val="00B0F0"/>
           <w:lang w:val="en-GB"/>
         </w:rPr>
         <w:t>This is the literature review section of the document.  In order for reader to better understand the problem, this section must provide an overview of the problem area using existing sources, e.g. web references, conference papers, white papers, patents or journal articles.  You are required to use proper APA referencing.  The idea with this section is that if a reader has no knowledge of the real-world problem area; this section should provide them enough background to understand the issue, e.g. an overview of the process that healthcare workers use when visiting patients in remote areas.</w:t>
@@ -1403,7 +1418,7 @@
         <mc:AlternateContent>
           <mc:Choice Requires="wpg">
             <w:drawing>
-              <wp:inline distT="0" distB="0" distL="0" distR="0" wp14:anchorId="33451930" wp14:editId="4CFC44E4">
+              <wp:inline distT="0" distB="0" distL="0" distR="0" wp14:anchorId="33451930" wp14:editId="1780FF7B">
                 <wp:extent cx="5439266" cy="4260916"/>
                 <wp:effectExtent l="0" t="0" r="0" b="6350"/>
                 <wp:docPr id="3" name="Group 3"/>
@@ -1524,7 +1539,7 @@
           </mc:Choice>
           <mc:Fallback>
             <w:pict>
-              <v:group w14:anchorId="33451930" id="Group 3" o:spid="_x0000_s1026" style="width:428.3pt;height:335.5pt;mso-position-horizontal-relative:char;mso-position-vertical-relative:line" coordsize="57277,45269" o:gfxdata="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">
+              <v:group w14:anchorId="33451930" id="Group 3" o:spid="_x0000_s1026" style="width:428.3pt;height:335.5pt;mso-position-horizontal-relative:char;mso-position-vertical-relative:line" coordsize="57277,45269" o:gfxdata="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">
                 <v:shapetype id="_x0000_t75" coordsize="21600,21600" o:spt="75" o:preferrelative="t" path="m@4@5l@4@11@9@11@9@5xe" filled="f" stroked="f">
                   <v:stroke joinstyle="miter"/>
                   <v:formulas>
@@ -1859,7 +1874,6 @@
         </w:rPr>
         <w:t xml:space="preserve">Orenda </w:t>
       </w:r>
-      <w:proofErr w:type="spellStart"/>
       <w:r>
         <w:rPr>
           <w:lang w:val="en-GB"/>
@@ -1870,14 +1884,7 @@
         <w:rPr>
           <w:lang w:val="en-GB"/>
         </w:rPr>
-        <w:t>tartup</w:t>
-      </w:r>
-      <w:proofErr w:type="spellEnd"/>
-      <w:r>
-        <w:rPr>
-          <w:lang w:val="en-GB"/>
-        </w:rPr>
-        <w:t xml:space="preserve"> </w:t>
+        <w:t xml:space="preserve">tartup </w:t>
       </w:r>
       <w:r>
         <w:rPr>
@@ -2148,8 +2155,6 @@
           <w:lang w:val="en-GB"/>
         </w:rPr>
       </w:pPr>
-      <w:bookmarkStart w:id="0" w:name="_GoBack"/>
-      <w:bookmarkEnd w:id="0"/>
     </w:p>
     <w:p>
       <w:pPr>
@@ -2228,13 +2233,56 @@
         </w:rPr>
         <w:t xml:space="preserve">he core of </w:t>
       </w:r>
+      <w:r>
+        <w:rPr>
+          <w:i/>
+          <w:lang w:val="en-GB"/>
+        </w:rPr>
+        <w:t>Orenda</w:t>
+      </w:r>
+      <w:r>
+        <w:rPr>
+          <w:lang w:val="en-GB"/>
+        </w:rPr>
+        <w:t xml:space="preserve">'s value is its scientific rigor. </w:t>
+      </w:r>
+      <w:r>
+        <w:rPr>
+          <w:lang w:val="en-GB"/>
+        </w:rPr>
+        <w:t>This chemical calculator provide</w:t>
+      </w:r>
+      <w:r>
+        <w:rPr>
+          <w:lang w:val="en-GB"/>
+        </w:rPr>
+        <w:t>s</w:t>
+      </w:r>
+      <w:r>
+        <w:rPr>
+          <w:lang w:val="en-GB"/>
+        </w:rPr>
+        <w:t xml:space="preserve"> a highly detailed system that allows users to check their pool specifications against</w:t>
+      </w:r>
+      <w:r>
+        <w:rPr>
+          <w:lang w:val="en-GB"/>
+        </w:rPr>
+        <w:t xml:space="preserve"> a well-tested system. </w:t>
+      </w:r>
+      <w:r>
+        <w:rPr>
+          <w:lang w:val="en-GB"/>
+        </w:rPr>
+        <w:t xml:space="preserve">We should adapt its focus on precise chemical calculations and correct water balance principles. </w:t>
+      </w:r>
       <w:proofErr w:type="spellStart"/>
       <w:r>
         <w:rPr>
           <w:i/>
           <w:lang w:val="en-GB"/>
         </w:rPr>
-        <w:t>Orenda</w:t>
+        <w:t>SplashScreen</w:t>
       </w:r>
       <w:r>
         <w:rPr>
@@ -2247,95 +2295,42 @@
         <w:rPr>
           <w:lang w:val="en-GB"/>
         </w:rPr>
-        <w:t xml:space="preserve"> value is its scientific rigor. </w:t>
-      </w:r>
-      <w:r>
-        <w:rPr>
-          <w:lang w:val="en-GB"/>
-        </w:rPr>
-        <w:t>This chemical calculator provide</w:t>
-      </w:r>
-      <w:r>
-        <w:rPr>
-          <w:lang w:val="en-GB"/>
-        </w:rPr>
-        <w:t>s</w:t>
-      </w:r>
-      <w:r>
-        <w:rPr>
-          <w:lang w:val="en-GB"/>
-        </w:rPr>
-        <w:t xml:space="preserve"> a highly detailed system that allows users to check their pool specifications against</w:t>
-      </w:r>
-      <w:r>
-        <w:rPr>
-          <w:lang w:val="en-GB"/>
-        </w:rPr>
-        <w:t xml:space="preserve"> a well-tested system. </w:t>
-      </w:r>
-      <w:r>
-        <w:rPr>
-          <w:lang w:val="en-GB"/>
-        </w:rPr>
-        <w:t xml:space="preserve">We should adapt its focus on precise chemical calculations and correct water balance principles. </w:t>
-      </w:r>
-      <w:proofErr w:type="spellStart"/>
+        <w:t xml:space="preserve"> water chemistry calculator must be scientifically sound and highly reliable.</w:t>
+      </w:r>
+    </w:p>
+    <w:p>
+      <w:pPr>
+        <w:rPr>
+          <w:lang w:val="en-GB"/>
+        </w:rPr>
+      </w:pPr>
+    </w:p>
+    <w:p>
+      <w:pPr>
+        <w:rPr>
+          <w:lang w:val="en-GB"/>
+        </w:rPr>
+      </w:pPr>
+      <w:r>
+        <w:rPr>
+          <w:b/>
+          <w:lang w:val="en-GB"/>
+        </w:rPr>
+        <w:t>Educational Content:</w:t>
+      </w:r>
+      <w:r>
+        <w:rPr>
+          <w:lang w:val="en-GB"/>
+        </w:rPr>
+        <w:t xml:space="preserve"> </w:t>
+      </w:r>
       <w:r>
         <w:rPr>
           <w:i/>
           <w:lang w:val="en-GB"/>
         </w:rPr>
-        <w:t>SplashScreen</w:t>
-      </w:r>
-      <w:r>
-        <w:rPr>
-          <w:lang w:val="en-GB"/>
-        </w:rPr>
-        <w:t>'s</w:t>
-      </w:r>
-      <w:proofErr w:type="spellEnd"/>
-      <w:r>
-        <w:rPr>
-          <w:lang w:val="en-GB"/>
-        </w:rPr>
-        <w:t xml:space="preserve"> water chemistry calculator must be scientifically sound and highly reliable.</w:t>
-      </w:r>
-    </w:p>
-    <w:p>
-      <w:pPr>
-        <w:rPr>
-          <w:lang w:val="en-GB"/>
-        </w:rPr>
-      </w:pPr>
-    </w:p>
-    <w:p>
-      <w:pPr>
-        <w:rPr>
-          <w:lang w:val="en-GB"/>
-        </w:rPr>
-      </w:pPr>
-      <w:r>
-        <w:rPr>
-          <w:b/>
-          <w:lang w:val="en-GB"/>
-        </w:rPr>
-        <w:t>Educational Content:</w:t>
-      </w:r>
-      <w:r>
-        <w:rPr>
-          <w:lang w:val="en-GB"/>
-        </w:rPr>
-        <w:t xml:space="preserve"> </w:t>
-      </w:r>
-      <w:proofErr w:type="spellStart"/>
-      <w:r>
-        <w:rPr>
-          <w:i/>
-          <w:lang w:val="en-GB"/>
-        </w:rPr>
         <w:t>Orenda’s</w:t>
       </w:r>
-      <w:proofErr w:type="spellEnd"/>
       <w:r>
         <w:rPr>
           <w:lang w:val="en-GB"/>
@@ -2900,6 +2895,7 @@
       </w:pPr>
       <w:r>
         <w:rPr>
+          <w:noProof/>
           <w:lang w:val="en-GB"/>
         </w:rPr>
         <w:lastRenderedPageBreak/>
@@ -2941,6 +2937,7 @@
       </w:r>
       <w:r>
         <w:rPr>
+          <w:noProof/>
           <w:lang w:val="en-GB"/>
         </w:rPr>
         <w:drawing>
@@ -2981,6 +2978,7 @@
       </w:r>
       <w:r>
         <w:rPr>
+          <w:noProof/>
           <w:lang w:val="en-GB"/>
         </w:rPr>
         <w:drawing>
@@ -3680,33 +3678,7 @@
         <w:rPr>
           <w:lang w:val="en-GB"/>
         </w:rPr>
-        <w:t xml:space="preserve"> This app, created by the highly respected </w:t>
-      </w:r>
-      <w:r>
-        <w:rPr>
-          <w:lang w:val="en-GB"/>
-        </w:rPr>
-        <w:t>Trouble-Free</w:t>
-      </w:r>
-      <w:r>
-        <w:rPr>
-          <w:lang w:val="en-GB"/>
-        </w:rPr>
-        <w:t xml:space="preserve"> Pool (</w:t>
-      </w:r>
-      <w:proofErr w:type="spellStart"/>
-      <w:r>
-        <w:rPr>
-          <w:lang w:val="en-GB"/>
-        </w:rPr>
-        <w:t>TFP</w:t>
-      </w:r>
-      <w:proofErr w:type="spellEnd"/>
-      <w:r>
-        <w:rPr>
-          <w:lang w:val="en-GB"/>
-        </w:rPr>
-        <w:t>) community, is considered the go-to app for DIY pool owners. It's a</w:t>
+        <w:t xml:space="preserve"> This app, created by the highly respected Trouble-Free Pool (TFP) community, is considered the go-to app for DIY pool owners. It's a</w:t>
       </w:r>
       <w:r>
         <w:rPr>
@@ -3760,6 +3732,7 @@
       </w:pPr>
       <w:r>
         <w:rPr>
+          <w:noProof/>
           <w:lang w:val="en-GB"/>
         </w:rPr>
         <w:drawing>
@@ -3806,6 +3779,7 @@
       </w:r>
       <w:r>
         <w:rPr>
+          <w:noProof/>
           <w:lang w:val="en-GB"/>
         </w:rPr>
         <w:drawing>
@@ -4237,23 +4211,13 @@
         </w:rPr>
         <w:t xml:space="preserve">As </w:t>
       </w:r>
-      <w:proofErr w:type="gramStart"/>
       <w:r>
         <w:rPr>
           <w:b/>
           <w:i/>
           <w:lang w:val="en-GB"/>
         </w:rPr>
-        <w:t>The</w:t>
-      </w:r>
-      <w:proofErr w:type="gramEnd"/>
-      <w:r>
-        <w:rPr>
-          <w:b/>
-          <w:i/>
-          <w:lang w:val="en-GB"/>
-        </w:rPr>
-        <w:t xml:space="preserve"> Ripple Effect</w:t>
+        <w:t>The Ripple Effect</w:t>
       </w:r>
       <w:r>
         <w:rPr>
@@ -4316,21 +4280,7 @@
         <w:rPr>
           <w:lang w:val="en-GB"/>
         </w:rPr>
-        <w:t xml:space="preserve">: While not built into the app itself, Pool Math's success is tied to the </w:t>
-      </w:r>
-      <w:proofErr w:type="spellStart"/>
-      <w:r>
-        <w:rPr>
-          <w:lang w:val="en-GB"/>
-        </w:rPr>
-        <w:t>TFP</w:t>
-      </w:r>
-      <w:proofErr w:type="spellEnd"/>
-      <w:r>
-        <w:rPr>
-          <w:lang w:val="en-GB"/>
-        </w:rPr>
-        <w:t xml:space="preserve"> online community. </w:t>
+        <w:t xml:space="preserve">: While not built into the app itself, Pool Math's success is tied to the TFP online community. </w:t>
       </w:r>
       <w:r>
         <w:rPr>
@@ -4589,14 +4539,14 @@
         <w:rPr>
           <w:rFonts w:asciiTheme="minorHAnsi" w:hAnsiTheme="minorHAnsi" w:cstheme="minorBidi"/>
           <w:i/>
-          <w:color w:val="auto"/>
+          <w:color w:val="00B0F0"/>
           <w:lang w:val="en-GB"/>
         </w:rPr>
       </w:pPr>
       <w:r>
         <w:rPr>
           <w:rFonts w:asciiTheme="minorHAnsi" w:hAnsiTheme="minorHAnsi" w:cstheme="minorBidi"/>
-          <w:color w:val="auto"/>
+          <w:color w:val="00B0F0"/>
           <w:lang w:val="en-GB"/>
         </w:rPr>
         <w:t xml:space="preserve">A project, or project management plan is a document that contains a project scope and objective. Typically, it will be represented as a Gannt chart to make it easy to convey information. </w:t>
@@ -4609,14 +4559,14 @@
         <w:rPr>
           <w:rFonts w:asciiTheme="minorHAnsi" w:hAnsiTheme="minorHAnsi" w:cstheme="minorBidi"/>
           <w:i/>
-          <w:color w:val="auto"/>
+          <w:color w:val="00B0F0"/>
           <w:lang w:val="en-GB"/>
         </w:rPr>
       </w:pPr>
       <w:r>
         <w:rPr>
           <w:rFonts w:asciiTheme="minorHAnsi" w:hAnsiTheme="minorHAnsi" w:cstheme="minorBidi"/>
-          <w:color w:val="auto"/>
+          <w:color w:val="00B0F0"/>
           <w:lang w:val="en-GB"/>
         </w:rPr>
         <w:t xml:space="preserve">A project plan should answer these questions: </w:t>
@@ -4632,14 +4582,14 @@
         <w:jc w:val="both"/>
         <w:rPr>
           <w:rFonts w:asciiTheme="minorHAnsi" w:hAnsiTheme="minorHAnsi"/>
-          <w:color w:val="auto"/>
+          <w:color w:val="00B0F0"/>
           <w:lang w:val="en-GB"/>
         </w:rPr>
       </w:pPr>
       <w:r>
         <w:rPr>
           <w:rFonts w:asciiTheme="minorHAnsi" w:hAnsiTheme="minorHAnsi"/>
-          <w:color w:val="auto"/>
+          <w:color w:val="00B0F0"/>
           <w:lang w:val="en-GB"/>
         </w:rPr>
         <w:t>What are we delivering?</w:t>
@@ -4655,14 +4605,14 @@
         <w:jc w:val="both"/>
         <w:rPr>
           <w:rFonts w:asciiTheme="minorHAnsi" w:hAnsiTheme="minorHAnsi"/>
-          <w:color w:val="auto"/>
+          <w:color w:val="00B0F0"/>
           <w:lang w:val="en-GB"/>
         </w:rPr>
       </w:pPr>
       <w:r>
         <w:rPr>
           <w:rFonts w:asciiTheme="minorHAnsi" w:hAnsiTheme="minorHAnsi"/>
-          <w:color w:val="auto"/>
+          <w:color w:val="00B0F0"/>
           <w:lang w:val="en-GB"/>
         </w:rPr>
         <w:t>How will we deliver on time?</w:t>
@@ -4679,14 +4629,14 @@
         <w:jc w:val="both"/>
         <w:rPr>
           <w:rFonts w:asciiTheme="minorHAnsi" w:hAnsiTheme="minorHAnsi"/>
-          <w:color w:val="auto"/>
+          <w:color w:val="00B0F0"/>
           <w:lang w:val="en-GB"/>
         </w:rPr>
       </w:pPr>
       <w:r>
         <w:rPr>
           <w:rFonts w:asciiTheme="minorHAnsi" w:hAnsiTheme="minorHAnsi"/>
-          <w:color w:val="auto"/>
+          <w:color w:val="00B0F0"/>
           <w:lang w:val="en-GB"/>
         </w:rPr>
         <w:t>Who is working on the project and in what role?</w:t>
@@ -4702,14 +4652,14 @@
         <w:jc w:val="both"/>
         <w:rPr>
           <w:rFonts w:asciiTheme="minorHAnsi" w:hAnsiTheme="minorHAnsi"/>
-          <w:color w:val="auto"/>
+          <w:color w:val="00B0F0"/>
           <w:lang w:val="en-GB"/>
         </w:rPr>
       </w:pPr>
       <w:r>
         <w:rPr>
           <w:rFonts w:asciiTheme="minorHAnsi" w:hAnsiTheme="minorHAnsi"/>
-          <w:color w:val="auto"/>
+          <w:color w:val="00B0F0"/>
           <w:lang w:val="en-GB"/>
         </w:rPr>
         <w:t>What miles stones/goals are set for project?</w:t>
@@ -4722,14 +4672,14 @@
         <w:rPr>
           <w:rFonts w:asciiTheme="minorHAnsi" w:hAnsiTheme="minorHAnsi" w:cstheme="minorBidi"/>
           <w:i/>
-          <w:color w:val="auto"/>
+          <w:color w:val="00B0F0"/>
           <w:lang w:val="en-GB"/>
         </w:rPr>
       </w:pPr>
       <w:r>
         <w:rPr>
           <w:rFonts w:asciiTheme="minorHAnsi" w:hAnsiTheme="minorHAnsi" w:cstheme="minorBidi"/>
-          <w:color w:val="auto"/>
+          <w:color w:val="00B0F0"/>
           <w:lang w:val="en-GB"/>
         </w:rPr>
         <w:t xml:space="preserve">Before you can start your project plan you need to understand (at a minimum) the following things: </w:t>
@@ -4745,14 +4695,14 @@
         <w:jc w:val="both"/>
         <w:rPr>
           <w:rFonts w:asciiTheme="minorHAnsi" w:hAnsiTheme="minorHAnsi"/>
-          <w:color w:val="auto"/>
+          <w:color w:val="00B0F0"/>
           <w:lang w:val="en-GB"/>
         </w:rPr>
       </w:pPr>
       <w:r>
         <w:rPr>
           <w:rFonts w:asciiTheme="minorHAnsi" w:hAnsiTheme="minorHAnsi"/>
-          <w:color w:val="auto"/>
+          <w:color w:val="00B0F0"/>
           <w:lang w:val="en-GB"/>
         </w:rPr>
         <w:lastRenderedPageBreak/>
@@ -4769,14 +4719,14 @@
         <w:jc w:val="both"/>
         <w:rPr>
           <w:rFonts w:asciiTheme="minorHAnsi" w:hAnsiTheme="minorHAnsi"/>
-          <w:color w:val="auto"/>
+          <w:color w:val="00B0F0"/>
           <w:lang w:val="en-GB"/>
         </w:rPr>
       </w:pPr>
       <w:r>
         <w:rPr>
           <w:rFonts w:asciiTheme="minorHAnsi" w:hAnsiTheme="minorHAnsi"/>
-          <w:color w:val="auto"/>
+          <w:color w:val="00B0F0"/>
           <w:lang w:val="en-GB"/>
         </w:rPr>
         <w:t>The goals of the project</w:t>
@@ -4792,14 +4742,14 @@
         <w:jc w:val="both"/>
         <w:rPr>
           <w:rFonts w:asciiTheme="minorHAnsi" w:hAnsiTheme="minorHAnsi"/>
-          <w:color w:val="auto"/>
+          <w:color w:val="00B0F0"/>
           <w:lang w:val="en-GB"/>
         </w:rPr>
       </w:pPr>
       <w:r>
         <w:rPr>
           <w:rFonts w:asciiTheme="minorHAnsi" w:hAnsiTheme="minorHAnsi"/>
-          <w:color w:val="auto"/>
+          <w:color w:val="00B0F0"/>
           <w:lang w:val="en-GB"/>
         </w:rPr>
         <w:t>What is the decision-making process of your client, and how will they approve and review the project work?</w:t>
@@ -4815,14 +4765,14 @@
         <w:jc w:val="both"/>
         <w:rPr>
           <w:rFonts w:asciiTheme="minorHAnsi" w:hAnsiTheme="minorHAnsi"/>
-          <w:color w:val="auto"/>
+          <w:color w:val="00B0F0"/>
           <w:lang w:val="en-GB"/>
         </w:rPr>
       </w:pPr>
       <w:r>
         <w:rPr>
           <w:rFonts w:asciiTheme="minorHAnsi" w:hAnsiTheme="minorHAnsi"/>
-          <w:color w:val="auto"/>
+          <w:color w:val="00B0F0"/>
           <w:lang w:val="en-GB"/>
         </w:rPr>
         <w:t>Who is the sponsor?</w:t>
@@ -4839,14 +4789,14 @@
         <w:jc w:val="both"/>
         <w:rPr>
           <w:rFonts w:asciiTheme="minorHAnsi" w:hAnsiTheme="minorHAnsi"/>
-          <w:color w:val="auto"/>
+          <w:color w:val="00B0F0"/>
           <w:lang w:val="en-GB"/>
         </w:rPr>
       </w:pPr>
       <w:r>
         <w:rPr>
           <w:rFonts w:asciiTheme="minorHAnsi" w:hAnsiTheme="minorHAnsi"/>
-          <w:color w:val="auto"/>
+          <w:color w:val="00B0F0"/>
           <w:lang w:val="en-GB"/>
         </w:rPr>
         <w:t xml:space="preserve">Who is the project manager? </w:t>
@@ -4862,14 +4812,14 @@
         <w:jc w:val="both"/>
         <w:rPr>
           <w:rFonts w:asciiTheme="minorHAnsi" w:hAnsiTheme="minorHAnsi"/>
-          <w:color w:val="auto"/>
+          <w:color w:val="00B0F0"/>
           <w:lang w:val="en-GB"/>
         </w:rPr>
       </w:pPr>
       <w:r>
         <w:rPr>
           <w:rFonts w:asciiTheme="minorHAnsi" w:hAnsiTheme="minorHAnsi"/>
-          <w:color w:val="auto"/>
+          <w:color w:val="00B0F0"/>
           <w:lang w:val="en-GB"/>
         </w:rPr>
         <w:t>What other stakeholders are important?</w:t>
@@ -4882,14 +4832,14 @@
         <w:rPr>
           <w:rFonts w:asciiTheme="minorHAnsi" w:hAnsiTheme="minorHAnsi" w:cstheme="minorBidi"/>
           <w:i/>
-          <w:color w:val="auto"/>
+          <w:color w:val="00B0F0"/>
           <w:lang w:val="en-GB"/>
         </w:rPr>
       </w:pPr>
       <w:r>
         <w:rPr>
           <w:rFonts w:asciiTheme="minorHAnsi" w:hAnsiTheme="minorHAnsi" w:cstheme="minorBidi"/>
-          <w:color w:val="auto"/>
+          <w:color w:val="00B0F0"/>
           <w:lang w:val="en-GB"/>
         </w:rPr>
         <w:t>As project manager you also need clarity from your client to know exactly what their expectations are. Sometimes this requires you to ask some hard questions to get a clear understanding.</w:t>
@@ -4902,14 +4852,14 @@
         <w:rPr>
           <w:rFonts w:asciiTheme="minorHAnsi" w:hAnsiTheme="minorHAnsi" w:cstheme="minorBidi"/>
           <w:i/>
-          <w:color w:val="auto"/>
+          <w:color w:val="00B0F0"/>
           <w:lang w:val="en-GB"/>
         </w:rPr>
       </w:pPr>
       <w:r>
         <w:rPr>
           <w:rFonts w:asciiTheme="minorHAnsi" w:hAnsiTheme="minorHAnsi" w:cstheme="minorBidi"/>
-          <w:color w:val="auto"/>
+          <w:color w:val="00B0F0"/>
           <w:lang w:val="en-GB"/>
         </w:rPr>
         <w:t xml:space="preserve">Questions that may impact a project plan: </w:t>
@@ -4925,14 +4875,14 @@
         <w:jc w:val="both"/>
         <w:rPr>
           <w:rFonts w:asciiTheme="minorHAnsi" w:hAnsiTheme="minorHAnsi"/>
-          <w:color w:val="auto"/>
+          <w:color w:val="00B0F0"/>
           <w:lang w:val="en-GB"/>
         </w:rPr>
       </w:pPr>
       <w:r>
         <w:rPr>
           <w:rFonts w:asciiTheme="minorHAnsi" w:hAnsiTheme="minorHAnsi"/>
-          <w:color w:val="auto"/>
+          <w:color w:val="00B0F0"/>
           <w:lang w:val="en-GB"/>
         </w:rPr>
         <w:t>How will you collect feedback?</w:t>
@@ -4948,14 +4898,14 @@
         <w:jc w:val="both"/>
         <w:rPr>
           <w:rFonts w:asciiTheme="minorHAnsi" w:hAnsiTheme="minorHAnsi"/>
-          <w:color w:val="auto"/>
+          <w:color w:val="00B0F0"/>
           <w:lang w:val="en-GB"/>
         </w:rPr>
       </w:pPr>
       <w:r>
         <w:rPr>
           <w:rFonts w:asciiTheme="minorHAnsi" w:hAnsiTheme="minorHAnsi"/>
-          <w:color w:val="auto"/>
+          <w:color w:val="00B0F0"/>
           <w:lang w:val="en-GB"/>
         </w:rPr>
         <w:t xml:space="preserve">Who has the final sign-off? </w:t>
@@ -4971,14 +4921,14 @@
         <w:jc w:val="both"/>
         <w:rPr>
           <w:rFonts w:asciiTheme="minorHAnsi" w:hAnsiTheme="minorHAnsi"/>
-          <w:color w:val="auto"/>
+          <w:color w:val="00B0F0"/>
           <w:lang w:val="en-GB"/>
         </w:rPr>
       </w:pPr>
       <w:r>
         <w:rPr>
           <w:rFonts w:asciiTheme="minorHAnsi" w:hAnsiTheme="minorHAnsi"/>
-          <w:color w:val="auto"/>
+          <w:color w:val="00B0F0"/>
           <w:lang w:val="en-GB"/>
         </w:rPr>
         <w:t xml:space="preserve">What is the project deadline? </w:t>
@@ -4994,14 +4944,14 @@
         <w:jc w:val="both"/>
         <w:rPr>
           <w:rFonts w:asciiTheme="minorHAnsi" w:hAnsiTheme="minorHAnsi"/>
-          <w:color w:val="auto"/>
+          <w:color w:val="00B0F0"/>
           <w:lang w:val="en-GB"/>
         </w:rPr>
       </w:pPr>
       <w:r>
         <w:rPr>
           <w:rFonts w:asciiTheme="minorHAnsi" w:hAnsiTheme="minorHAnsi"/>
-          <w:color w:val="auto"/>
+          <w:color w:val="00B0F0"/>
           <w:lang w:val="en-GB"/>
         </w:rPr>
         <w:t>What is the availability of the project team?</w:t>
@@ -5017,14 +4967,14 @@
         <w:jc w:val="both"/>
         <w:rPr>
           <w:rFonts w:asciiTheme="minorHAnsi" w:hAnsiTheme="minorHAnsi"/>
-          <w:color w:val="auto"/>
+          <w:color w:val="00B0F0"/>
           <w:lang w:val="en-GB"/>
         </w:rPr>
       </w:pPr>
       <w:r>
         <w:rPr>
           <w:rFonts w:asciiTheme="minorHAnsi" w:hAnsiTheme="minorHAnsi"/>
-          <w:color w:val="auto"/>
+          <w:color w:val="00B0F0"/>
           <w:lang w:val="en-GB"/>
         </w:rPr>
         <w:t>How often will the teams meet for feedback?</w:t>
@@ -5040,14 +4990,14 @@
         <w:jc w:val="both"/>
         <w:rPr>
           <w:rFonts w:asciiTheme="minorHAnsi" w:hAnsiTheme="minorHAnsi"/>
-          <w:color w:val="auto"/>
+          <w:color w:val="00B0F0"/>
           <w:lang w:val="en-GB"/>
         </w:rPr>
       </w:pPr>
       <w:r>
         <w:rPr>
           <w:rFonts w:asciiTheme="minorHAnsi" w:hAnsiTheme="minorHAnsi"/>
-          <w:color w:val="auto"/>
+          <w:color w:val="00B0F0"/>
           <w:lang w:val="en-GB"/>
         </w:rPr>
         <w:t>Does your team have a history of successful projects?</w:t>
@@ -5064,14 +5014,14 @@
         <w:jc w:val="both"/>
         <w:rPr>
           <w:rFonts w:asciiTheme="minorHAnsi" w:hAnsiTheme="minorHAnsi"/>
-          <w:color w:val="auto"/>
+          <w:color w:val="00B0F0"/>
           <w:lang w:val="en-GB"/>
         </w:rPr>
       </w:pPr>
       <w:r>
         <w:rPr>
           <w:rFonts w:asciiTheme="minorHAnsi" w:hAnsiTheme="minorHAnsi"/>
-          <w:color w:val="auto"/>
+          <w:color w:val="00B0F0"/>
           <w:lang w:val="en-GB"/>
         </w:rPr>
         <w:t>What can prevent the project from being a success?</w:t>
@@ -5087,14 +5037,14 @@
         <w:jc w:val="both"/>
         <w:rPr>
           <w:rFonts w:asciiTheme="minorHAnsi" w:hAnsiTheme="minorHAnsi"/>
-          <w:color w:val="auto"/>
+          <w:color w:val="00B0F0"/>
           <w:lang w:val="en-GB"/>
         </w:rPr>
       </w:pPr>
       <w:r>
         <w:rPr>
           <w:rFonts w:asciiTheme="minorHAnsi" w:hAnsiTheme="minorHAnsi"/>
-          <w:color w:val="auto"/>
+          <w:color w:val="00B0F0"/>
           <w:lang w:val="en-GB"/>
         </w:rPr>
         <w:t xml:space="preserve">What tools and methods of communication will the team use? </w:t>
@@ -5108,7 +5058,7 @@
           <w:rFonts w:asciiTheme="minorHAnsi" w:hAnsiTheme="minorHAnsi" w:cstheme="minorBidi"/>
           <w:i/>
           <w:iCs/>
-          <w:color w:val="auto"/>
+          <w:color w:val="00B0F0"/>
           <w:lang w:val="en-GB"/>
         </w:rPr>
       </w:pPr>
@@ -5117,7 +5067,7 @@
           <w:rFonts w:asciiTheme="minorHAnsi" w:hAnsiTheme="minorHAnsi" w:cstheme="minorBidi"/>
           <w:i/>
           <w:iCs/>
-          <w:color w:val="auto"/>
+          <w:color w:val="00B0F0"/>
           <w:lang w:val="en-GB"/>
         </w:rPr>
         <w:t>Your</w:t>
@@ -5127,7 +5077,7 @@
           <w:rFonts w:asciiTheme="minorHAnsi" w:hAnsiTheme="minorHAnsi" w:cstheme="minorBidi"/>
           <w:i/>
           <w:iCs/>
-          <w:color w:val="auto"/>
+          <w:color w:val="00B0F0"/>
           <w:lang w:val="en-GB"/>
         </w:rPr>
         <w:t xml:space="preserve"> project plan should include the following information (at the very minimum):</w:t>
@@ -5145,7 +5095,7 @@
           <w:rFonts w:asciiTheme="minorHAnsi" w:hAnsiTheme="minorHAnsi"/>
           <w:i/>
           <w:iCs/>
-          <w:color w:val="auto"/>
+          <w:color w:val="00B0F0"/>
           <w:lang w:val="en-GB"/>
         </w:rPr>
       </w:pPr>
@@ -5154,7 +5104,7 @@
           <w:rFonts w:asciiTheme="minorHAnsi" w:hAnsiTheme="minorHAnsi"/>
           <w:i/>
           <w:iCs/>
-          <w:color w:val="auto"/>
+          <w:color w:val="00B0F0"/>
           <w:lang w:val="en-GB"/>
         </w:rPr>
         <w:t>Project and client name</w:t>
@@ -5164,7 +5114,7 @@
           <w:rFonts w:asciiTheme="minorHAnsi" w:hAnsiTheme="minorHAnsi"/>
           <w:i/>
           <w:iCs/>
-          <w:color w:val="auto"/>
+          <w:color w:val="00B0F0"/>
           <w:lang w:val="en-GB"/>
         </w:rPr>
         <w:t xml:space="preserve"> (make one up)</w:t>
@@ -5182,7 +5132,7 @@
           <w:rFonts w:asciiTheme="minorHAnsi" w:hAnsiTheme="minorHAnsi"/>
           <w:i/>
           <w:iCs/>
-          <w:color w:val="auto"/>
+          <w:color w:val="00B0F0"/>
           <w:lang w:val="en-GB"/>
         </w:rPr>
       </w:pPr>
@@ -5191,7 +5141,7 @@
           <w:rFonts w:asciiTheme="minorHAnsi" w:hAnsiTheme="minorHAnsi"/>
           <w:i/>
           <w:iCs/>
-          <w:color w:val="auto"/>
+          <w:color w:val="00B0F0"/>
           <w:lang w:val="en-GB"/>
         </w:rPr>
         <w:t>Delivery date and version</w:t>
@@ -5209,7 +5159,7 @@
           <w:rFonts w:asciiTheme="minorHAnsi" w:hAnsiTheme="minorHAnsi"/>
           <w:i/>
           <w:iCs/>
-          <w:color w:val="auto"/>
+          <w:color w:val="00B0F0"/>
           <w:lang w:val="en-GB"/>
         </w:rPr>
       </w:pPr>
@@ -5218,7 +5168,7 @@
           <w:rFonts w:asciiTheme="minorHAnsi" w:hAnsiTheme="minorHAnsi"/>
           <w:i/>
           <w:iCs/>
-          <w:color w:val="auto"/>
+          <w:color w:val="00B0F0"/>
           <w:lang w:val="en-GB"/>
         </w:rPr>
         <w:t>Milestones and deliverables</w:t>
@@ -5237,7 +5187,7 @@
           <w:rFonts w:asciiTheme="minorHAnsi" w:hAnsiTheme="minorHAnsi"/>
           <w:i/>
           <w:iCs/>
-          <w:color w:val="auto"/>
+          <w:color w:val="00B0F0"/>
           <w:lang w:val="en-GB"/>
         </w:rPr>
       </w:pPr>
@@ -5246,7 +5196,7 @@
           <w:rFonts w:asciiTheme="minorHAnsi" w:hAnsiTheme="minorHAnsi"/>
           <w:i/>
           <w:iCs/>
-          <w:color w:val="auto"/>
+          <w:color w:val="00B0F0"/>
           <w:lang w:val="en-GB"/>
         </w:rPr>
         <w:t>Clear task durations with start and end dates</w:t>
@@ -5256,7 +5206,7 @@
           <w:rFonts w:asciiTheme="minorHAnsi" w:hAnsiTheme="minorHAnsi"/>
           <w:i/>
           <w:iCs/>
-          <w:color w:val="auto"/>
+          <w:color w:val="00B0F0"/>
           <w:lang w:val="en-GB"/>
         </w:rPr>
         <w:t xml:space="preserve"> (using a Gantt chart)</w:t>
@@ -5274,7 +5224,7 @@
           <w:rFonts w:asciiTheme="minorHAnsi" w:hAnsiTheme="minorHAnsi"/>
           <w:i/>
           <w:iCs/>
-          <w:color w:val="auto"/>
+          <w:color w:val="00B0F0"/>
           <w:lang w:val="en-GB"/>
         </w:rPr>
       </w:pPr>
@@ -5283,7 +5233,7 @@
           <w:rFonts w:asciiTheme="minorHAnsi" w:hAnsiTheme="minorHAnsi"/>
           <w:i/>
           <w:iCs/>
-          <w:color w:val="auto"/>
+          <w:color w:val="00B0F0"/>
           <w:lang w:val="en-GB"/>
         </w:rPr>
         <w:t>Dependencies for tasks</w:t>
@@ -5293,7 +5243,7 @@
           <w:rFonts w:asciiTheme="minorHAnsi" w:hAnsiTheme="minorHAnsi"/>
           <w:i/>
           <w:iCs/>
-          <w:color w:val="auto"/>
+          <w:color w:val="00B0F0"/>
           <w:lang w:val="en-GB"/>
         </w:rPr>
         <w:t xml:space="preserve"> (i.e., should anything happen before this task can happen).</w:t>
@@ -5347,14 +5297,14 @@
         <w:rPr>
           <w:rFonts w:asciiTheme="minorHAnsi" w:hAnsiTheme="minorHAnsi" w:cstheme="minorBidi"/>
           <w:i/>
-          <w:color w:val="auto"/>
+          <w:color w:val="00B0F0"/>
           <w:lang w:val="en-GB"/>
         </w:rPr>
       </w:pPr>
       <w:r>
         <w:rPr>
           <w:rFonts w:asciiTheme="minorHAnsi" w:hAnsiTheme="minorHAnsi" w:cstheme="minorBidi"/>
-          <w:color w:val="auto"/>
+          <w:color w:val="00B0F0"/>
           <w:lang w:val="en-GB"/>
         </w:rPr>
         <w:t xml:space="preserve">A risk can be defined as an unexpected event or condition, which can impact negatively on the entire project. Some will argue that the event or condition can also affect the project in a positive way. </w:t>
@@ -5367,14 +5317,14 @@
         <w:rPr>
           <w:rFonts w:asciiTheme="minorHAnsi" w:hAnsiTheme="minorHAnsi" w:cstheme="minorBidi"/>
           <w:i/>
-          <w:color w:val="auto"/>
+          <w:color w:val="00B0F0"/>
           <w:lang w:val="en-GB"/>
         </w:rPr>
       </w:pPr>
       <w:r>
         <w:rPr>
           <w:rFonts w:asciiTheme="minorHAnsi" w:hAnsiTheme="minorHAnsi" w:cstheme="minorBidi"/>
-          <w:color w:val="auto"/>
+          <w:color w:val="00B0F0"/>
           <w:lang w:val="en-GB"/>
         </w:rPr>
         <w:lastRenderedPageBreak/>
@@ -5383,7 +5333,7 @@
       <w:r>
         <w:rPr>
           <w:rFonts w:asciiTheme="minorHAnsi" w:hAnsiTheme="minorHAnsi" w:cstheme="minorBidi"/>
-          <w:color w:val="auto"/>
+          <w:color w:val="00B0F0"/>
           <w:lang w:val="en-GB"/>
         </w:rPr>
         <w:t xml:space="preserve">For instance:  </w:t>
@@ -5393,7 +5343,7 @@
           <w:rFonts w:asciiTheme="minorHAnsi" w:hAnsiTheme="minorHAnsi" w:cstheme="minorBidi"/>
           <w:i/>
           <w:iCs/>
-          <w:color w:val="auto"/>
+          <w:color w:val="00B0F0"/>
           <w:lang w:val="en-GB"/>
         </w:rPr>
         <w:t>The entire project could be ruined if a woman in labour runs across a road and a driver has to swerve to avoid her. The driver crashes into a bus and loses a wheel, which rolls across the road, pulls along a bag of dynamite, which was about to be used. The dynamite then explodes next to a lamppost, which shoots, like a rocket, through the window of the project teams office. The rocket hits the project leader in the head and the project leader, by mistake, deletes all the code, which has been written. The rocket continues through the office and finally lands on a shelf filled with super magnets, which then fall onto the server, which contains all the backups and removes them all.</w:t>
@@ -5401,7 +5351,7 @@
       <w:r>
         <w:rPr>
           <w:rFonts w:asciiTheme="minorHAnsi" w:hAnsiTheme="minorHAnsi" w:cstheme="minorBidi"/>
-          <w:color w:val="auto"/>
+          <w:color w:val="00B0F0"/>
           <w:lang w:val="en-GB"/>
         </w:rPr>
         <w:t xml:space="preserve"> But how likely is this? </w:t>
@@ -5414,14 +5364,14 @@
         <w:rPr>
           <w:rFonts w:asciiTheme="minorHAnsi" w:hAnsiTheme="minorHAnsi" w:cstheme="minorBidi"/>
           <w:i/>
-          <w:color w:val="auto"/>
+          <w:color w:val="00B0F0"/>
           <w:lang w:val="en-GB"/>
         </w:rPr>
       </w:pPr>
       <w:r>
         <w:rPr>
           <w:rFonts w:asciiTheme="minorHAnsi" w:hAnsiTheme="minorHAnsi" w:cstheme="minorBidi"/>
-          <w:color w:val="auto"/>
+          <w:color w:val="00B0F0"/>
           <w:lang w:val="en-GB"/>
         </w:rPr>
         <w:t xml:space="preserve">Once you have identified the risks, you need to decide how you will handle those risks. It is a good idea to divide the risks into four main categories: </w:t>
@@ -5434,7 +5384,7 @@
         <w:rPr>
           <w:rFonts w:asciiTheme="minorHAnsi" w:hAnsiTheme="minorHAnsi" w:cstheme="minorBidi"/>
           <w:i/>
-          <w:color w:val="auto"/>
+          <w:color w:val="00B0F0"/>
           <w:lang w:val="en-GB"/>
         </w:rPr>
       </w:pPr>
@@ -5443,7 +5393,7 @@
           <w:rFonts w:asciiTheme="minorHAnsi" w:hAnsiTheme="minorHAnsi" w:cstheme="minorBidi"/>
           <w:b/>
           <w:bCs/>
-          <w:color w:val="auto"/>
+          <w:color w:val="00B0F0"/>
           <w:lang w:val="en-GB"/>
         </w:rPr>
         <w:t>Acceptable risks:</w:t>
@@ -5451,7 +5401,7 @@
       <w:r>
         <w:rPr>
           <w:rFonts w:asciiTheme="minorHAnsi" w:hAnsiTheme="minorHAnsi" w:cstheme="minorBidi"/>
-          <w:color w:val="auto"/>
+          <w:color w:val="00B0F0"/>
           <w:lang w:val="en-GB"/>
         </w:rPr>
         <w:t xml:space="preserve">  </w:t>
@@ -5459,7 +5409,7 @@
       <w:r>
         <w:rPr>
           <w:rFonts w:asciiTheme="minorHAnsi" w:hAnsiTheme="minorHAnsi" w:cstheme="minorBidi"/>
-          <w:color w:val="auto"/>
+          <w:color w:val="00B0F0"/>
           <w:lang w:val="en-GB"/>
         </w:rPr>
         <w:t>We decide that the risk is very unlikely, or possibly, that the costs if that event happens, are lower than the expenses which are necessary to prevent the event from taking place.</w:t>
@@ -5472,7 +5422,7 @@
         <w:rPr>
           <w:rFonts w:asciiTheme="minorHAnsi" w:hAnsiTheme="minorHAnsi" w:cstheme="minorBidi"/>
           <w:i/>
-          <w:color w:val="auto"/>
+          <w:color w:val="00B0F0"/>
           <w:lang w:val="en-GB"/>
         </w:rPr>
       </w:pPr>
@@ -5481,7 +5431,7 @@
           <w:rFonts w:asciiTheme="minorHAnsi" w:hAnsiTheme="minorHAnsi" w:cstheme="minorBidi"/>
           <w:b/>
           <w:bCs/>
-          <w:color w:val="auto"/>
+          <w:color w:val="00B0F0"/>
           <w:lang w:val="en-GB"/>
         </w:rPr>
         <w:t>Avoidable risks:</w:t>
@@ -5489,7 +5439,7 @@
       <w:r>
         <w:rPr>
           <w:rFonts w:asciiTheme="minorHAnsi" w:hAnsiTheme="minorHAnsi" w:cstheme="minorBidi"/>
-          <w:color w:val="auto"/>
+          <w:color w:val="00B0F0"/>
           <w:lang w:val="en-GB"/>
         </w:rPr>
         <w:t xml:space="preserve"> </w:t>
@@ -5497,7 +5447,7 @@
       <w:r>
         <w:rPr>
           <w:rFonts w:asciiTheme="minorHAnsi" w:hAnsiTheme="minorHAnsi" w:cstheme="minorBidi"/>
-          <w:color w:val="auto"/>
+          <w:color w:val="00B0F0"/>
           <w:lang w:val="en-GB"/>
         </w:rPr>
         <w:t xml:space="preserve"> We </w:t>
@@ -5506,7 +5456,7 @@
       <w:r>
         <w:rPr>
           <w:rFonts w:asciiTheme="minorHAnsi" w:hAnsiTheme="minorHAnsi" w:cstheme="minorBidi"/>
-          <w:color w:val="auto"/>
+          <w:color w:val="00B0F0"/>
           <w:lang w:val="en-GB"/>
         </w:rPr>
         <w:t>take action</w:t>
@@ -5515,7 +5465,7 @@
       <w:r>
         <w:rPr>
           <w:rFonts w:asciiTheme="minorHAnsi" w:hAnsiTheme="minorHAnsi" w:cstheme="minorBidi"/>
-          <w:color w:val="auto"/>
+          <w:color w:val="00B0F0"/>
           <w:lang w:val="en-GB"/>
         </w:rPr>
         <w:t xml:space="preserve"> which ensures that we prevent a certain event or condition. We might create backups of all the code and store it in two separate locations. Then we avoid the risk of losing anything,</w:t>
@@ -5528,7 +5478,7 @@
         <w:rPr>
           <w:rFonts w:asciiTheme="minorHAnsi" w:hAnsiTheme="minorHAnsi" w:cstheme="minorBidi"/>
           <w:i/>
-          <w:color w:val="auto"/>
+          <w:color w:val="00B0F0"/>
           <w:lang w:val="en-GB"/>
         </w:rPr>
       </w:pPr>
@@ -5537,7 +5487,7 @@
           <w:rFonts w:asciiTheme="minorHAnsi" w:hAnsiTheme="minorHAnsi" w:cstheme="minorBidi"/>
           <w:b/>
           <w:bCs/>
-          <w:color w:val="auto"/>
+          <w:color w:val="00B0F0"/>
           <w:lang w:val="en-GB"/>
         </w:rPr>
         <w:t>Minimizable risks:</w:t>
@@ -5545,7 +5495,7 @@
       <w:r>
         <w:rPr>
           <w:rFonts w:asciiTheme="minorHAnsi" w:hAnsiTheme="minorHAnsi" w:cstheme="minorBidi"/>
-          <w:color w:val="auto"/>
+          <w:color w:val="00B0F0"/>
           <w:lang w:val="en-GB"/>
         </w:rPr>
         <w:t xml:space="preserve"> We take steps to ensure that the likelihood of something happening is less. We can create a bonus structure to make sure that people do not leave.</w:t>
@@ -5557,7 +5507,7 @@
         <w:jc w:val="both"/>
         <w:rPr>
           <w:rFonts w:asciiTheme="minorHAnsi" w:hAnsiTheme="minorHAnsi" w:cstheme="minorBidi"/>
-          <w:color w:val="auto"/>
+          <w:color w:val="00B0F0"/>
           <w:lang w:val="en-GB"/>
         </w:rPr>
       </w:pPr>
@@ -5566,7 +5516,7 @@
           <w:rFonts w:asciiTheme="minorHAnsi" w:hAnsiTheme="minorHAnsi" w:cstheme="minorBidi"/>
           <w:b/>
           <w:bCs/>
-          <w:color w:val="auto"/>
+          <w:color w:val="00B0F0"/>
           <w:lang w:val="en-GB"/>
         </w:rPr>
         <w:t>Transferable risks:</w:t>
@@ -5574,7 +5524,7 @@
       <w:r>
         <w:rPr>
           <w:rFonts w:asciiTheme="minorHAnsi" w:hAnsiTheme="minorHAnsi" w:cstheme="minorBidi"/>
-          <w:color w:val="auto"/>
+          <w:color w:val="00B0F0"/>
           <w:lang w:val="en-GB"/>
         </w:rPr>
         <w:t xml:space="preserve"> This means that we transfer the risk to someone else. For example, we might send part of the work to another company. Then it is the other company, which needs to assume the risk.  Once we have categorised all the risks, we need to decide exactly what needs to be done, if something should be done. We need to prepare ourselves as best we can so that any potential events have as little impact on the project as possible. We can, of course, have free fruit available at work and encourage everyone to exercise regularly. But someone will get sick in any case and then it is great to know how we handle that. Who is going to take over the sick person's work? When is it necessary for someone to step in? Should the person step in be someone in the team or someone from outside the team? In the case of the latter, where should the person be brought in from? How much </w:t>
@@ -5582,7 +5532,7 @@
       <w:r>
         <w:rPr>
           <w:rFonts w:asciiTheme="minorHAnsi" w:hAnsiTheme="minorHAnsi" w:cstheme="minorBidi"/>
-          <w:color w:val="auto"/>
+          <w:color w:val="00B0F0"/>
           <w:lang w:val="en-GB"/>
         </w:rPr>
         <w:t>w</w:t>
@@ -5590,7 +5540,7 @@
       <w:r>
         <w:rPr>
           <w:rFonts w:asciiTheme="minorHAnsi" w:hAnsiTheme="minorHAnsi" w:cstheme="minorBidi"/>
-          <w:color w:val="auto"/>
+          <w:color w:val="00B0F0"/>
           <w:lang w:val="en-GB"/>
         </w:rPr>
         <w:t>ill this cost?</w:t>
@@ -5604,7 +5554,7 @@
           <w:rFonts w:asciiTheme="minorHAnsi" w:hAnsiTheme="minorHAnsi" w:cstheme="minorBidi"/>
           <w:i/>
           <w:iCs/>
-          <w:color w:val="auto"/>
+          <w:color w:val="00B0F0"/>
           <w:lang w:val="en-GB"/>
         </w:rPr>
       </w:pPr>
@@ -5613,7 +5563,7 @@
           <w:rFonts w:asciiTheme="minorHAnsi" w:hAnsiTheme="minorHAnsi" w:cstheme="minorBidi"/>
           <w:i/>
           <w:iCs/>
-          <w:color w:val="auto"/>
+          <w:color w:val="00B0F0"/>
           <w:lang w:val="en-GB"/>
         </w:rPr>
         <w:t>Identify (at least) 4 risks to your project.  If you have time, add more, since the more you are able to identify at the start, the better you can plan for things to go wrong (and they usually do).  For each risk, state which type of risk it is and how you will treat/handle the risk.</w:t>
@@ -5667,27 +5617,6 @@
         <w:t xml:space="preserve">  References</w:t>
       </w:r>
       <w:proofErr w:type="gramEnd"/>
-    </w:p>
-    <w:p>
-      <w:pPr>
-        <w:rPr>
-          <w:lang w:val="en-GB"/>
-        </w:rPr>
-      </w:pPr>
-    </w:p>
-    <w:p>
-      <w:pPr>
-        <w:rPr>
-          <w:lang w:val="en-GB"/>
-        </w:rPr>
-      </w:pPr>
-      <w:r>
-        <w:rPr>
-          <w:lang w:val="en-GB"/>
-        </w:rPr>
-        <w:lastRenderedPageBreak/>
-        <w:t>Your reference list here.</w:t>
-      </w:r>
     </w:p>
     <w:p>
       <w:pPr>
@@ -5707,7 +5636,7 @@
 </file>
 
 <file path=word/endnotes.xml><?xml version="1.0" encoding="utf-8"?>
-<w:endnotes xmlns:wpc="http://schemas.microsoft.com/office/word/2010/wordprocessingCanvas" xmlns:cx="http://schemas.microsoft.com/office/drawing/2014/chartex" xmlns:cx1="http://schemas.microsoft.com/office/drawing/2015/9/8/chartex" xmlns:cx2="http://schemas.microsoft.com/office/drawing/2015/10/21/chartex" xmlns:cx3="http://schemas.microsoft.com/office/drawing/2016/5/9/chartex" xmlns:cx4="http://schemas.microsoft.com/office/drawing/2016/5/10/chartex" xmlns:cx5="http://schemas.microsoft.com/office/drawing/2016/5/11/chartex" xmlns:cx6="http://schemas.microsoft.com/office/drawing/2016/5/12/chartex" xmlns:cx7="http://schemas.microsoft.com/office/drawing/2016/5/13/chartex" xmlns:cx8="http://schemas.microsoft.com/office/drawing/2016/5/14/chartex" xmlns:mc="http://schemas.openxmlformats.org/markup-compatibility/2006" xmlns:aink="http://schemas.microsoft.com/office/drawing/2016/ink" xmlns:am3d="http://schemas.microsoft.com/office/drawing/2017/model3d" xmlns:o="urn:schemas-microsoft-com:office:office" xmlns:r="http://schemas.openxmlformats.org/officeDocument/2006/relationships" xmlns:m="http://schemas.openxmlformats.org/officeDocument/2006/math" xmlns:v="urn:schemas-microsoft-com:vml" xmlns:wp14="http://schemas.microsoft.com/office/word/2010/wordprocessingDrawing" xmlns:wp="http://schemas.openxmlformats.org/drawingml/2006/wordprocessingDrawing" xmlns:w10="urn:schemas-microsoft-com:office:word" xmlns:w="http://schemas.openxmlformats.org/wordprocessingml/2006/main" xmlns:w14="http://schemas.microsoft.com/office/word/2010/wordml" xmlns:w15="http://schemas.microsoft.com/office/word/2012/wordml" xmlns:w16cid="http://schemas.microsoft.com/office/word/2016/wordml/cid" xmlns:w16se="http://schemas.microsoft.com/office/word/2015/wordml/symex" xmlns:wpg="http://schemas.microsoft.com/office/word/2010/wordprocessingGroup" xmlns:wpi="http://schemas.microsoft.com/office/word/2010/wordprocessingInk" xmlns:wne="http://schemas.microsoft.com/office/word/2006/wordml" xmlns:wps="http://schemas.microsoft.com/office/word/2010/wordprocessingShape" mc:Ignorable="w14 w15 w16se w16cid wp14">
+<w:endnotes xmlns:wpc="http://schemas.microsoft.com/office/word/2010/wordprocessingCanvas" xmlns:cx="http://schemas.microsoft.com/office/drawing/2014/chartex" xmlns:cx1="http://schemas.microsoft.com/office/drawing/2015/9/8/chartex" xmlns:cx2="http://schemas.microsoft.com/office/drawing/2015/10/21/chartex" xmlns:cx3="http://schemas.microsoft.com/office/drawing/2016/5/9/chartex" xmlns:cx4="http://schemas.microsoft.com/office/drawing/2016/5/10/chartex" xmlns:cx5="http://schemas.microsoft.com/office/drawing/2016/5/11/chartex" xmlns:cx6="http://schemas.microsoft.com/office/drawing/2016/5/12/chartex" xmlns:cx7="http://schemas.microsoft.com/office/drawing/2016/5/13/chartex" xmlns:cx8="http://schemas.microsoft.com/office/drawing/2016/5/14/chartex" xmlns:mc="http://schemas.openxmlformats.org/markup-compatibility/2006" xmlns:aink="http://schemas.microsoft.com/office/drawing/2016/ink" xmlns:am3d="http://schemas.microsoft.com/office/drawing/2017/model3d" xmlns:o="urn:schemas-microsoft-com:office:office" xmlns:oel="http://schemas.microsoft.com/office/2019/extlst" xmlns:r="http://schemas.openxmlformats.org/officeDocument/2006/relationships" xmlns:m="http://schemas.openxmlformats.org/officeDocument/2006/math" xmlns:v="urn:schemas-microsoft-com:vml" xmlns:wp14="http://schemas.microsoft.com/office/word/2010/wordprocessingDrawing" xmlns:wp="http://schemas.openxmlformats.org/drawingml/2006/wordprocessingDrawing" xmlns:w10="urn:schemas-microsoft-com:office:word" xmlns:w="http://schemas.openxmlformats.org/wordprocessingml/2006/main" xmlns:w14="http://schemas.microsoft.com/office/word/2010/wordml" xmlns:w15="http://schemas.microsoft.com/office/word/2012/wordml" xmlns:w16cex="http://schemas.microsoft.com/office/word/2018/wordml/cex" xmlns:w16cid="http://schemas.microsoft.com/office/word/2016/wordml/cid" xmlns:w16="http://schemas.microsoft.com/office/word/2018/wordml" xmlns:w16du="http://schemas.microsoft.com/office/word/2023/wordml/word16du" xmlns:w16sdtdh="http://schemas.microsoft.com/office/word/2020/wordml/sdtdatahash" xmlns:w16sdtfl="http://schemas.microsoft.com/office/word/2024/wordml/sdtformatlock" xmlns:w16se="http://schemas.microsoft.com/office/word/2015/wordml/symex" xmlns:wpg="http://schemas.microsoft.com/office/word/2010/wordprocessingGroup" xmlns:wpi="http://schemas.microsoft.com/office/word/2010/wordprocessingInk" xmlns:wne="http://schemas.microsoft.com/office/word/2006/wordml" xmlns:wps="http://schemas.microsoft.com/office/word/2010/wordprocessingShape" mc:Ignorable="w14 w15 w16se w16cid w16 w16cex w16sdtdh w16sdtfl w16du wp14">
   <w:endnote w:type="separator" w:id="-1">
     <w:p>
       <w:r>
@@ -5726,7 +5655,7 @@
 </file>
 
 <file path=word/footnotes.xml><?xml version="1.0" encoding="utf-8"?>
-<w:footnotes xmlns:wpc="http://schemas.microsoft.com/office/word/2010/wordprocessingCanvas" xmlns:cx="http://schemas.microsoft.com/office/drawing/2014/chartex" xmlns:cx1="http://schemas.microsoft.com/office/drawing/2015/9/8/chartex" xmlns:cx2="http://schemas.microsoft.com/office/drawing/2015/10/21/chartex" xmlns:cx3="http://schemas.microsoft.com/office/drawing/2016/5/9/chartex" xmlns:cx4="http://schemas.microsoft.com/office/drawing/2016/5/10/chartex" xmlns:cx5="http://schemas.microsoft.com/office/drawing/2016/5/11/chartex" xmlns:cx6="http://schemas.microsoft.com/office/drawing/2016/5/12/chartex" xmlns:cx7="http://schemas.microsoft.com/office/drawing/2016/5/13/chartex" xmlns:cx8="http://schemas.microsoft.com/office/drawing/2016/5/14/chartex" xmlns:mc="http://schemas.openxmlformats.org/markup-compatibility/2006" xmlns:aink="http://schemas.microsoft.com/office/drawing/2016/ink" xmlns:am3d="http://schemas.microsoft.com/office/drawing/2017/model3d" xmlns:o="urn:schemas-microsoft-com:office:office" xmlns:r="http://schemas.openxmlformats.org/officeDocument/2006/relationships" xmlns:m="http://schemas.openxmlformats.org/officeDocument/2006/math" xmlns:v="urn:schemas-microsoft-com:vml" xmlns:wp14="http://schemas.microsoft.com/office/word/2010/wordprocessingDrawing" xmlns:wp="http://schemas.openxmlformats.org/drawingml/2006/wordprocessingDrawing" xmlns:w10="urn:schemas-microsoft-com:office:word" xmlns:w="http://schemas.openxmlformats.org/wordprocessingml/2006/main" xmlns:w14="http://schemas.microsoft.com/office/word/2010/wordml" xmlns:w15="http://schemas.microsoft.com/office/word/2012/wordml" xmlns:w16cid="http://schemas.microsoft.com/office/word/2016/wordml/cid" xmlns:w16se="http://schemas.microsoft.com/office/word/2015/wordml/symex" xmlns:wpg="http://schemas.microsoft.com/office/word/2010/wordprocessingGroup" xmlns:wpi="http://schemas.microsoft.com/office/word/2010/wordprocessingInk" xmlns:wne="http://schemas.microsoft.com/office/word/2006/wordml" xmlns:wps="http://schemas.microsoft.com/office/word/2010/wordprocessingShape" mc:Ignorable="w14 w15 w16se w16cid wp14">
+<w:footnotes xmlns:wpc="http://schemas.microsoft.com/office/word/2010/wordprocessingCanvas" xmlns:cx="http://schemas.microsoft.com/office/drawing/2014/chartex" xmlns:cx1="http://schemas.microsoft.com/office/drawing/2015/9/8/chartex" xmlns:cx2="http://schemas.microsoft.com/office/drawing/2015/10/21/chartex" xmlns:cx3="http://schemas.microsoft.com/office/drawing/2016/5/9/chartex" xmlns:cx4="http://schemas.microsoft.com/office/drawing/2016/5/10/chartex" xmlns:cx5="http://schemas.microsoft.com/office/drawing/2016/5/11/chartex" xmlns:cx6="http://schemas.microsoft.com/office/drawing/2016/5/12/chartex" xmlns:cx7="http://schemas.microsoft.com/office/drawing/2016/5/13/chartex" xmlns:cx8="http://schemas.microsoft.com/office/drawing/2016/5/14/chartex" xmlns:mc="http://schemas.openxmlformats.org/markup-compatibility/2006" xmlns:aink="http://schemas.microsoft.com/office/drawing/2016/ink" xmlns:am3d="http://schemas.microsoft.com/office/drawing/2017/model3d" xmlns:o="urn:schemas-microsoft-com:office:office" xmlns:oel="http://schemas.microsoft.com/office/2019/extlst" xmlns:r="http://schemas.openxmlformats.org/officeDocument/2006/relationships" xmlns:m="http://schemas.openxmlformats.org/officeDocument/2006/math" xmlns:v="urn:schemas-microsoft-com:vml" xmlns:wp14="http://schemas.microsoft.com/office/word/2010/wordprocessingDrawing" xmlns:wp="http://schemas.openxmlformats.org/drawingml/2006/wordprocessingDrawing" xmlns:w10="urn:schemas-microsoft-com:office:word" xmlns:w="http://schemas.openxmlformats.org/wordprocessingml/2006/main" xmlns:w14="http://schemas.microsoft.com/office/word/2010/wordml" xmlns:w15="http://schemas.microsoft.com/office/word/2012/wordml" xmlns:w16cex="http://schemas.microsoft.com/office/word/2018/wordml/cex" xmlns:w16cid="http://schemas.microsoft.com/office/word/2016/wordml/cid" xmlns:w16="http://schemas.microsoft.com/office/word/2018/wordml" xmlns:w16du="http://schemas.microsoft.com/office/word/2023/wordml/word16du" xmlns:w16sdtdh="http://schemas.microsoft.com/office/word/2020/wordml/sdtdatahash" xmlns:w16sdtfl="http://schemas.microsoft.com/office/word/2024/wordml/sdtformatlock" xmlns:w16se="http://schemas.microsoft.com/office/word/2015/wordml/symex" xmlns:wpg="http://schemas.microsoft.com/office/word/2010/wordprocessingGroup" xmlns:wpi="http://schemas.microsoft.com/office/word/2010/wordprocessingInk" xmlns:wne="http://schemas.microsoft.com/office/word/2006/wordml" xmlns:wps="http://schemas.microsoft.com/office/word/2010/wordprocessingShape" mc:Ignorable="w14 w15 w16se w16cid w16 w16cex w16sdtdh w16sdtfl w16du wp14">
   <w:footnote w:type="separator" w:id="-1">
     <w:p>
       <w:r>
@@ -5745,7 +5674,7 @@
 </file>
 
 <file path=word/numbering.xml><?xml version="1.0" encoding="utf-8"?>
-<w:numbering xmlns:wpc="http://schemas.microsoft.com/office/word/2010/wordprocessingCanvas" xmlns:cx="http://schemas.microsoft.com/office/drawing/2014/chartex" xmlns:cx1="http://schemas.microsoft.com/office/drawing/2015/9/8/chartex" xmlns:cx2="http://schemas.microsoft.com/office/drawing/2015/10/21/chartex" xmlns:cx3="http://schemas.microsoft.com/office/drawing/2016/5/9/chartex" xmlns:cx4="http://schemas.microsoft.com/office/drawing/2016/5/10/chartex" xmlns:cx5="http://schemas.microsoft.com/office/drawing/2016/5/11/chartex" xmlns:cx6="http://schemas.microsoft.com/office/drawing/2016/5/12/chartex" xmlns:cx7="http://schemas.microsoft.com/office/drawing/2016/5/13/chartex" xmlns:cx8="http://schemas.microsoft.com/office/drawing/2016/5/14/chartex" xmlns:mc="http://schemas.openxmlformats.org/markup-compatibility/2006" xmlns:aink="http://schemas.microsoft.com/office/drawing/2016/ink" xmlns:am3d="http://schemas.microsoft.com/office/drawing/2017/model3d" xmlns:o="urn:schemas-microsoft-com:office:office" xmlns:r="http://schemas.openxmlformats.org/officeDocument/2006/relationships" xmlns:m="http://schemas.openxmlformats.org/officeDocument/2006/math" xmlns:v="urn:schemas-microsoft-com:vml" xmlns:wp14="http://schemas.microsoft.com/office/word/2010/wordprocessingDrawing" xmlns:wp="http://schemas.openxmlformats.org/drawingml/2006/wordprocessingDrawing" xmlns:w10="urn:schemas-microsoft-com:office:word" xmlns:w="http://schemas.openxmlformats.org/wordprocessingml/2006/main" xmlns:w14="http://schemas.microsoft.com/office/word/2010/wordml" xmlns:w15="http://schemas.microsoft.com/office/word/2012/wordml" xmlns:w16cid="http://schemas.microsoft.com/office/word/2016/wordml/cid" xmlns:w16se="http://schemas.microsoft.com/office/word/2015/wordml/symex" xmlns:wpg="http://schemas.microsoft.com/office/word/2010/wordprocessingGroup" xmlns:wpi="http://schemas.microsoft.com/office/word/2010/wordprocessingInk" xmlns:wne="http://schemas.microsoft.com/office/word/2006/wordml" xmlns:wps="http://schemas.microsoft.com/office/word/2010/wordprocessingShape" mc:Ignorable="w14 w15 w16se w16cid wp14">
+<w:numbering xmlns:wpc="http://schemas.microsoft.com/office/word/2010/wordprocessingCanvas" xmlns:cx="http://schemas.microsoft.com/office/drawing/2014/chartex" xmlns:cx1="http://schemas.microsoft.com/office/drawing/2015/9/8/chartex" xmlns:cx2="http://schemas.microsoft.com/office/drawing/2015/10/21/chartex" xmlns:cx3="http://schemas.microsoft.com/office/drawing/2016/5/9/chartex" xmlns:cx4="http://schemas.microsoft.com/office/drawing/2016/5/10/chartex" xmlns:cx5="http://schemas.microsoft.com/office/drawing/2016/5/11/chartex" xmlns:cx6="http://schemas.microsoft.com/office/drawing/2016/5/12/chartex" xmlns:cx7="http://schemas.microsoft.com/office/drawing/2016/5/13/chartex" xmlns:cx8="http://schemas.microsoft.com/office/drawing/2016/5/14/chartex" xmlns:mc="http://schemas.openxmlformats.org/markup-compatibility/2006" xmlns:aink="http://schemas.microsoft.com/office/drawing/2016/ink" xmlns:am3d="http://schemas.microsoft.com/office/drawing/2017/model3d" xmlns:o="urn:schemas-microsoft-com:office:office" xmlns:oel="http://schemas.microsoft.com/office/2019/extlst" xmlns:r="http://schemas.openxmlformats.org/officeDocument/2006/relationships" xmlns:m="http://schemas.openxmlformats.org/officeDocument/2006/math" xmlns:v="urn:schemas-microsoft-com:vml" xmlns:wp14="http://schemas.microsoft.com/office/word/2010/wordprocessingDrawing" xmlns:wp="http://schemas.openxmlformats.org/drawingml/2006/wordprocessingDrawing" xmlns:w10="urn:schemas-microsoft-com:office:word" xmlns:w="http://schemas.openxmlformats.org/wordprocessingml/2006/main" xmlns:w14="http://schemas.microsoft.com/office/word/2010/wordml" xmlns:w15="http://schemas.microsoft.com/office/word/2012/wordml" xmlns:w16cex="http://schemas.microsoft.com/office/word/2018/wordml/cex" xmlns:w16cid="http://schemas.microsoft.com/office/word/2016/wordml/cid" xmlns:w16="http://schemas.microsoft.com/office/word/2018/wordml" xmlns:w16du="http://schemas.microsoft.com/office/word/2023/wordml/word16du" xmlns:w16sdtdh="http://schemas.microsoft.com/office/word/2020/wordml/sdtdatahash" xmlns:w16sdtfl="http://schemas.microsoft.com/office/word/2024/wordml/sdtformatlock" xmlns:w16se="http://schemas.microsoft.com/office/word/2015/wordml/symex" xmlns:wpg="http://schemas.microsoft.com/office/word/2010/wordprocessingGroup" xmlns:wpi="http://schemas.microsoft.com/office/word/2010/wordprocessingInk" xmlns:wne="http://schemas.microsoft.com/office/word/2006/wordml" xmlns:wps="http://schemas.microsoft.com/office/word/2010/wordprocessingShape" mc:Ignorable="w14 w15 w16se w16cid w16 w16cex w16sdtdh w16sdtfl w16du wp14">
   <w:abstractNum w:abstractNumId="0" w15:restartNumberingAfterBreak="0">
     <w:nsid w:val="028257A6"/>
     <w:multiLevelType w:val="hybridMultilevel"/>
@@ -6802,19 +6731,19 @@
       </w:rPr>
     </w:lvl>
   </w:abstractNum>
-  <w:num w:numId="1">
+  <w:num w:numId="1" w16cid:durableId="1227685909">
     <w:abstractNumId w:val="5"/>
   </w:num>
-  <w:num w:numId="2">
+  <w:num w:numId="2" w16cid:durableId="1985545419">
     <w:abstractNumId w:val="1"/>
   </w:num>
-  <w:num w:numId="3">
+  <w:num w:numId="3" w16cid:durableId="2075083447">
     <w:abstractNumId w:val="6"/>
   </w:num>
-  <w:num w:numId="4">
+  <w:num w:numId="4" w16cid:durableId="1976831641">
     <w:abstractNumId w:val="8"/>
   </w:num>
-  <w:num w:numId="5">
+  <w:num w:numId="5" w16cid:durableId="742096298">
     <w:abstractNumId w:val="8"/>
     <w:lvlOverride w:ilvl="0">
       <w:startOverride w:val="1"/>
@@ -6954,7 +6883,7 @@
       </w:lvl>
     </w:lvlOverride>
   </w:num>
-  <w:num w:numId="6">
+  <w:num w:numId="6" w16cid:durableId="1126045051">
     <w:abstractNumId w:val="8"/>
     <w:lvlOverride w:ilvl="0">
       <w:startOverride w:val="1"/>
@@ -7094,7 +7023,7 @@
       </w:lvl>
     </w:lvlOverride>
   </w:num>
-  <w:num w:numId="7">
+  <w:num w:numId="7" w16cid:durableId="581793761">
     <w:abstractNumId w:val="8"/>
     <w:lvlOverride w:ilvl="0">
       <w:startOverride w:val="1"/>
@@ -7234,7 +7163,7 @@
       </w:lvl>
     </w:lvlOverride>
   </w:num>
-  <w:num w:numId="8">
+  <w:num w:numId="8" w16cid:durableId="1922182453">
     <w:abstractNumId w:val="8"/>
     <w:lvlOverride w:ilvl="0">
       <w:startOverride w:val="1"/>
@@ -7374,26 +7303,26 @@
       </w:lvl>
     </w:lvlOverride>
   </w:num>
-  <w:num w:numId="9">
+  <w:num w:numId="9" w16cid:durableId="1928923501">
     <w:abstractNumId w:val="2"/>
   </w:num>
-  <w:num w:numId="10">
+  <w:num w:numId="10" w16cid:durableId="1704594312">
     <w:abstractNumId w:val="7"/>
   </w:num>
-  <w:num w:numId="11">
+  <w:num w:numId="11" w16cid:durableId="1524632442">
     <w:abstractNumId w:val="4"/>
   </w:num>
-  <w:num w:numId="12">
+  <w:num w:numId="12" w16cid:durableId="290553404">
     <w:abstractNumId w:val="3"/>
   </w:num>
-  <w:num w:numId="13">
+  <w:num w:numId="13" w16cid:durableId="25256965">
     <w:abstractNumId w:val="0"/>
   </w:num>
 </w:numbering>
 </file>
 
 <file path=word/styles.xml><?xml version="1.0" encoding="utf-8"?>
-<w:styles xmlns:mc="http://schemas.openxmlformats.org/markup-compatibility/2006" xmlns:r="http://schemas.openxmlformats.org/officeDocument/2006/relationships" xmlns:w="http://schemas.openxmlformats.org/wordprocessingml/2006/main" xmlns:w14="http://schemas.microsoft.com/office/word/2010/wordml" xmlns:w15="http://schemas.microsoft.com/office/word/2012/wordml" xmlns:w16cid="http://schemas.microsoft.com/office/word/2016/wordml/cid" xmlns:w16se="http://schemas.microsoft.com/office/word/2015/wordml/symex" mc:Ignorable="w14 w15 w16se w16cid">
+<w:styles xmlns:mc="http://schemas.openxmlformats.org/markup-compatibility/2006" xmlns:r="http://schemas.openxmlformats.org/officeDocument/2006/relationships" xmlns:w="http://schemas.openxmlformats.org/wordprocessingml/2006/main" xmlns:w14="http://schemas.microsoft.com/office/word/2010/wordml" xmlns:w15="http://schemas.microsoft.com/office/word/2012/wordml" xmlns:w16cex="http://schemas.microsoft.com/office/word/2018/wordml/cex" xmlns:w16cid="http://schemas.microsoft.com/office/word/2016/wordml/cid" xmlns:w16="http://schemas.microsoft.com/office/word/2018/wordml" xmlns:w16du="http://schemas.microsoft.com/office/word/2023/wordml/word16du" xmlns:w16sdtdh="http://schemas.microsoft.com/office/word/2020/wordml/sdtdatahash" xmlns:w16sdtfl="http://schemas.microsoft.com/office/word/2024/wordml/sdtformatlock" xmlns:w16se="http://schemas.microsoft.com/office/word/2015/wordml/symex" mc:Ignorable="w14 w15 w16se w16cid w16 w16cex w16sdtdh w16sdtfl w16du">
   <w:docDefaults>
     <w:rPrDefault>
       <w:rPr>
@@ -7405,7 +7334,7 @@
     </w:rPrDefault>
     <w:pPrDefault/>
   </w:docDefaults>
-  <w:latentStyles w:defLockedState="0" w:defUIPriority="99" w:defSemiHidden="0" w:defUnhideWhenUsed="0" w:defQFormat="0" w:count="375">
+  <w:latentStyles w:defLockedState="0" w:defUIPriority="99" w:defSemiHidden="0" w:defUnhideWhenUsed="0" w:defQFormat="0" w:count="376">
     <w:lsdException w:name="Normal" w:uiPriority="0" w:qFormat="1"/>
     <w:lsdException w:name="heading 1" w:uiPriority="9" w:qFormat="1"/>
     <w:lsdException w:name="heading 2" w:semiHidden="1" w:uiPriority="9" w:unhideWhenUsed="1" w:qFormat="1"/>
@@ -7781,6 +7710,7 @@
     <w:lsdException w:name="Smart Hyperlink" w:semiHidden="1" w:unhideWhenUsed="1"/>
     <w:lsdException w:name="Hashtag" w:semiHidden="1" w:unhideWhenUsed="1"/>
     <w:lsdException w:name="Unresolved Mention" w:semiHidden="1" w:unhideWhenUsed="1"/>
+    <w:lsdException w:name="Smart Link" w:semiHidden="1" w:unhideWhenUsed="1"/>
   </w:latentStyles>
   <w:style w:type="paragraph" w:default="1" w:styleId="Normal">
     <w:name w:val="Normal"/>

</xml_diff>

<commit_message>
Added Draft points on Project Plan
</commit_message>
<xml_diff>
--- a/Documentation/Business case template.docx
+++ b/Documentation/Business case template.docx
@@ -1,6 +1,6 @@
 
 <file path=word/document.xml><?xml version="1.0" encoding="utf-8"?>
-<w:document xmlns:wpc="http://schemas.microsoft.com/office/word/2010/wordprocessingCanvas" xmlns:cx="http://schemas.microsoft.com/office/drawing/2014/chartex" xmlns:cx1="http://schemas.microsoft.com/office/drawing/2015/9/8/chartex" xmlns:cx2="http://schemas.microsoft.com/office/drawing/2015/10/21/chartex" xmlns:cx3="http://schemas.microsoft.com/office/drawing/2016/5/9/chartex" xmlns:cx4="http://schemas.microsoft.com/office/drawing/2016/5/10/chartex" xmlns:cx5="http://schemas.microsoft.com/office/drawing/2016/5/11/chartex" xmlns:cx6="http://schemas.microsoft.com/office/drawing/2016/5/12/chartex" xmlns:cx7="http://schemas.microsoft.com/office/drawing/2016/5/13/chartex" xmlns:cx8="http://schemas.microsoft.com/office/drawing/2016/5/14/chartex" xmlns:mc="http://schemas.openxmlformats.org/markup-compatibility/2006" xmlns:aink="http://schemas.microsoft.com/office/drawing/2016/ink" xmlns:am3d="http://schemas.microsoft.com/office/drawing/2017/model3d" xmlns:o="urn:schemas-microsoft-com:office:office" xmlns:oel="http://schemas.microsoft.com/office/2019/extlst" xmlns:r="http://schemas.openxmlformats.org/officeDocument/2006/relationships" xmlns:m="http://schemas.openxmlformats.org/officeDocument/2006/math" xmlns:v="urn:schemas-microsoft-com:vml" xmlns:wp14="http://schemas.microsoft.com/office/word/2010/wordprocessingDrawing" xmlns:wp="http://schemas.openxmlformats.org/drawingml/2006/wordprocessingDrawing" xmlns:w10="urn:schemas-microsoft-com:office:word" xmlns:w="http://schemas.openxmlformats.org/wordprocessingml/2006/main" xmlns:w14="http://schemas.microsoft.com/office/word/2010/wordml" xmlns:w15="http://schemas.microsoft.com/office/word/2012/wordml" xmlns:w16cex="http://schemas.microsoft.com/office/word/2018/wordml/cex" xmlns:w16cid="http://schemas.microsoft.com/office/word/2016/wordml/cid" xmlns:w16="http://schemas.microsoft.com/office/word/2018/wordml" xmlns:w16du="http://schemas.microsoft.com/office/word/2023/wordml/word16du" xmlns:w16sdtdh="http://schemas.microsoft.com/office/word/2020/wordml/sdtdatahash" xmlns:w16sdtfl="http://schemas.microsoft.com/office/word/2024/wordml/sdtformatlock" xmlns:w16se="http://schemas.microsoft.com/office/word/2015/wordml/symex" xmlns:wpg="http://schemas.microsoft.com/office/word/2010/wordprocessingGroup" xmlns:wpi="http://schemas.microsoft.com/office/word/2010/wordprocessingInk" xmlns:wne="http://schemas.microsoft.com/office/word/2006/wordml" xmlns:wps="http://schemas.microsoft.com/office/word/2010/wordprocessingShape" mc:Ignorable="w14 w15 w16se w16cid w16 w16cex w16sdtdh w16sdtfl w16du wp14">
+<w:document xmlns:wpc="http://schemas.microsoft.com/office/word/2010/wordprocessingCanvas" xmlns:cx="http://schemas.microsoft.com/office/drawing/2014/chartex" xmlns:cx1="http://schemas.microsoft.com/office/drawing/2015/9/8/chartex" xmlns:cx2="http://schemas.microsoft.com/office/drawing/2015/10/21/chartex" xmlns:cx3="http://schemas.microsoft.com/office/drawing/2016/5/9/chartex" xmlns:cx4="http://schemas.microsoft.com/office/drawing/2016/5/10/chartex" xmlns:cx5="http://schemas.microsoft.com/office/drawing/2016/5/11/chartex" xmlns:cx6="http://schemas.microsoft.com/office/drawing/2016/5/12/chartex" xmlns:cx7="http://schemas.microsoft.com/office/drawing/2016/5/13/chartex" xmlns:cx8="http://schemas.microsoft.com/office/drawing/2016/5/14/chartex" xmlns:mc="http://schemas.openxmlformats.org/markup-compatibility/2006" xmlns:aink="http://schemas.microsoft.com/office/drawing/2016/ink" xmlns:am3d="http://schemas.microsoft.com/office/drawing/2017/model3d" xmlns:o="urn:schemas-microsoft-com:office:office" xmlns:r="http://schemas.openxmlformats.org/officeDocument/2006/relationships" xmlns:m="http://schemas.openxmlformats.org/officeDocument/2006/math" xmlns:v="urn:schemas-microsoft-com:vml" xmlns:wp14="http://schemas.microsoft.com/office/word/2010/wordprocessingDrawing" xmlns:wp="http://schemas.openxmlformats.org/drawingml/2006/wordprocessingDrawing" xmlns:w10="urn:schemas-microsoft-com:office:word" xmlns:w="http://schemas.openxmlformats.org/wordprocessingml/2006/main" xmlns:w14="http://schemas.microsoft.com/office/word/2010/wordml" xmlns:w15="http://schemas.microsoft.com/office/word/2012/wordml" xmlns:w16cid="http://schemas.microsoft.com/office/word/2016/wordml/cid" xmlns:w16se="http://schemas.microsoft.com/office/word/2015/wordml/symex" xmlns:wpg="http://schemas.microsoft.com/office/word/2010/wordprocessingGroup" xmlns:wpi="http://schemas.microsoft.com/office/word/2010/wordprocessingInk" xmlns:wne="http://schemas.microsoft.com/office/word/2006/wordml" xmlns:wps="http://schemas.microsoft.com/office/word/2010/wordprocessingShape" mc:Ignorable="w14 w15 w16se w16cid wp14">
   <w:body>
     <w:p>
       <w:pPr>
@@ -1539,7 +1539,7 @@
           </mc:Choice>
           <mc:Fallback>
             <w:pict>
-              <v:group w14:anchorId="33451930" id="Group 3" o:spid="_x0000_s1026" style="width:428.3pt;height:335.5pt;mso-position-horizontal-relative:char;mso-position-vertical-relative:line" coordsize="57277,45269" o:gfxdata="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